<commit_message>
change all dfd chapter 3
</commit_message>
<xml_diff>
--- a/บทที่ 2.docx
+++ b/บทที่ 2.docx
@@ -874,146 +874,6 @@
         <w:pStyle w:val="font-claude-response-body"/>
         <w:tabs>
           <w:tab w:val="left" w:pos="567"/>
-        </w:tabs>
-        <w:spacing w:before="0" w:beforeAutospacing="0" w:after="0" w:afterAutospacing="0"/>
-        <w:jc w:val="thaiDistribute"/>
-        <w:rPr>
-          <w:rFonts w:ascii="TH SarabunPSK" w:hAnsi="TH SarabunPSK" w:cs="TH SarabunPSK"/>
-          <w:sz w:val="32"/>
-          <w:szCs w:val="32"/>
-        </w:rPr>
-      </w:pPr>
-      <w:r>
-        <w:rPr>
-          <w:rFonts w:ascii="TH SarabunPSK" w:hAnsi="TH SarabunPSK" w:cs="TH SarabunPSK"/>
-          <w:sz w:val="32"/>
-          <w:szCs w:val="32"/>
-        </w:rPr>
-        <w:tab/>
-      </w:r>
-      <w:r>
-        <w:rPr>
-          <w:rFonts w:ascii="TH SarabunPSK" w:hAnsi="TH SarabunPSK" w:cs="TH SarabunPSK"/>
-          <w:sz w:val="32"/>
-          <w:szCs w:val="32"/>
-          <w:cs/>
-        </w:rPr>
-        <w:t xml:space="preserve">ในระดับองค์กร </w:t>
-      </w:r>
-      <w:r>
-        <w:rPr>
-          <w:rFonts w:ascii="TH SarabunPSK" w:hAnsi="TH SarabunPSK" w:cs="TH SarabunPSK"/>
-          <w:sz w:val="32"/>
-          <w:szCs w:val="32"/>
-        </w:rPr>
-        <w:t xml:space="preserve">AI Agents </w:t>
-      </w:r>
-      <w:r>
-        <w:rPr>
-          <w:rFonts w:ascii="TH SarabunPSK" w:hAnsi="TH SarabunPSK" w:cs="TH SarabunPSK"/>
-          <w:sz w:val="32"/>
-          <w:szCs w:val="32"/>
-          <w:cs/>
-        </w:rPr>
-        <w:t>สามารถช่วยแก้ไขภารกิจที่มีความซับซ้อนได้หลากหลายด้าน ตั้งแต่การออกแบบซอฟต์แวร์</w:t>
-      </w:r>
-      <w:r>
-        <w:rPr>
-          <w:rFonts w:ascii="TH SarabunPSK" w:hAnsi="TH SarabunPSK" w:cs="TH SarabunPSK"/>
-          <w:sz w:val="32"/>
-          <w:szCs w:val="32"/>
-        </w:rPr>
-        <w:t xml:space="preserve">, </w:t>
-      </w:r>
-      <w:r>
-        <w:rPr>
-          <w:rFonts w:ascii="TH SarabunPSK" w:hAnsi="TH SarabunPSK" w:cs="TH SarabunPSK"/>
-          <w:sz w:val="32"/>
-          <w:szCs w:val="32"/>
-          <w:cs/>
-        </w:rPr>
-        <w:t>การทำระบบไอทีอัตโนมัติ (</w:t>
-      </w:r>
-      <w:r>
-        <w:rPr>
-          <w:rFonts w:ascii="TH SarabunPSK" w:hAnsi="TH SarabunPSK" w:cs="TH SarabunPSK"/>
-          <w:sz w:val="32"/>
-          <w:szCs w:val="32"/>
-        </w:rPr>
-        <w:t xml:space="preserve">IT Automation), </w:t>
-      </w:r>
-      <w:r>
-        <w:rPr>
-          <w:rFonts w:ascii="TH SarabunPSK" w:hAnsi="TH SarabunPSK" w:cs="TH SarabunPSK"/>
-          <w:sz w:val="32"/>
-          <w:szCs w:val="32"/>
-          <w:cs/>
-        </w:rPr>
-        <w:t>การเขียนโค้ดโปรแกรม ไปจนถึงการทำหน้าที่เป็นผู้ช่วยสนทนา โดยระบบเหล่านี้จะใช้เทคนิคขั้นสูงของโมเดลภาษาขนาดใหญ่ (</w:t>
-      </w:r>
-      <w:r>
-        <w:rPr>
-          <w:rFonts w:ascii="TH SarabunPSK" w:hAnsi="TH SarabunPSK" w:cs="TH SarabunPSK"/>
-          <w:sz w:val="32"/>
-          <w:szCs w:val="32"/>
-        </w:rPr>
-        <w:t xml:space="preserve">LLMs) </w:t>
-      </w:r>
-      <w:r>
-        <w:rPr>
-          <w:rFonts w:ascii="TH SarabunPSK" w:hAnsi="TH SarabunPSK" w:cs="TH SarabunPSK"/>
-          <w:sz w:val="32"/>
-          <w:szCs w:val="32"/>
-          <w:cs/>
-        </w:rPr>
-        <w:t>ในการทำความเข้าใจและตอบสนองต่อคำสั่งของผู้ใช้งานอย่างเป็นลำดับขั้นตอน พร้อมทั้งมีความสามารถในการพิจารณาตัดสินใจได้เองว่าจะเรียกใช้งานเครื่องมือภายนอกเมื่อใดเพื่อให้งานสำเร็จลุล่วง</w:t>
-      </w:r>
-    </w:p>
-    <w:p>
-      <w:pPr>
-        <w:pStyle w:val="font-claude-response-body"/>
-        <w:tabs>
-          <w:tab w:val="left" w:pos="567"/>
-        </w:tabs>
-        <w:spacing w:before="0" w:beforeAutospacing="0" w:after="0" w:afterAutospacing="0"/>
-        <w:jc w:val="thaiDistribute"/>
-        <w:rPr>
-          <w:rFonts w:ascii="TH SarabunPSK" w:hAnsi="TH SarabunPSK" w:cs="TH SarabunPSK"/>
-          <w:sz w:val="32"/>
-          <w:szCs w:val="32"/>
-        </w:rPr>
-      </w:pPr>
-    </w:p>
-    <w:p>
-      <w:pPr>
-        <w:pStyle w:val="font-claude-response-body"/>
-        <w:tabs>
-          <w:tab w:val="left" w:pos="567"/>
-        </w:tabs>
-        <w:spacing w:before="0" w:beforeAutospacing="0" w:after="0" w:afterAutospacing="0"/>
-        <w:jc w:val="thaiDistribute"/>
-        <w:rPr>
-          <w:rFonts w:ascii="TH SarabunPSK" w:hAnsi="TH SarabunPSK" w:cs="TH SarabunPSK"/>
-          <w:sz w:val="32"/>
-          <w:szCs w:val="32"/>
-        </w:rPr>
-      </w:pPr>
-      <w:r>
-        <w:rPr>
-          <w:rFonts w:ascii="TH SarabunPSK" w:hAnsi="TH SarabunPSK" w:cs="TH SarabunPSK"/>
-          <w:sz w:val="32"/>
-          <w:szCs w:val="32"/>
-          <w:cs/>
-        </w:rPr>
-        <w:tab/>
-      </w:r>
-    </w:p>
-    <w:p>
-      <w:pPr>
-        <w:pStyle w:val="font-claude-response-body"/>
-        <w:tabs>
-          <w:tab w:val="left" w:pos="567"/>
-          <w:tab w:val="left" w:pos="1276"/>
         </w:tabs>
         <w:spacing w:before="0" w:beforeAutospacing="0" w:after="0" w:afterAutospacing="0"/>
         <w:jc w:val="thaiDistribute"/>
@@ -1037,6 +897,170 @@
           <w:rFonts w:ascii="TH SarabunPSK" w:hAnsi="TH SarabunPSK" w:cs="TH SarabunPSK"/>
           <w:sz w:val="32"/>
           <w:szCs w:val="32"/>
+        </w:rPr>
+        <w:tab/>
+      </w:r>
+      <w:r>
+        <w:rPr>
+          <w:rFonts w:ascii="TH SarabunPSK" w:hAnsi="TH SarabunPSK" w:cs="TH SarabunPSK"/>
+          <w:sz w:val="32"/>
+          <w:szCs w:val="32"/>
+          <w:cs/>
+        </w:rPr>
+        <w:t xml:space="preserve">ในระดับองค์กร </w:t>
+      </w:r>
+      <w:r>
+        <w:rPr>
+          <w:rFonts w:ascii="TH SarabunPSK" w:hAnsi="TH SarabunPSK" w:cs="TH SarabunPSK"/>
+          <w:sz w:val="32"/>
+          <w:szCs w:val="32"/>
+        </w:rPr>
+        <w:t xml:space="preserve">AI Agents </w:t>
+      </w:r>
+      <w:r>
+        <w:rPr>
+          <w:rFonts w:ascii="TH SarabunPSK" w:hAnsi="TH SarabunPSK" w:cs="TH SarabunPSK"/>
+          <w:sz w:val="32"/>
+          <w:szCs w:val="32"/>
+          <w:cs/>
+        </w:rPr>
+        <w:t>สามารถช่วยแก้ไขภารกิจที่มีความซับซ้อนได้หลากหลายด้าน ตั้งแต่การออกแบบซอฟต์แวร์</w:t>
+      </w:r>
+      <w:r>
+        <w:rPr>
+          <w:rFonts w:ascii="TH SarabunPSK" w:hAnsi="TH SarabunPSK" w:cs="TH SarabunPSK"/>
+          <w:sz w:val="32"/>
+          <w:szCs w:val="32"/>
+        </w:rPr>
+        <w:t xml:space="preserve">, </w:t>
+      </w:r>
+      <w:r>
+        <w:rPr>
+          <w:rFonts w:ascii="TH SarabunPSK" w:hAnsi="TH SarabunPSK" w:cs="TH SarabunPSK"/>
+          <w:sz w:val="32"/>
+          <w:szCs w:val="32"/>
+          <w:cs/>
+        </w:rPr>
+        <w:t>การทำระบบไอทีอัตโนมัติ (</w:t>
+      </w:r>
+      <w:r>
+        <w:rPr>
+          <w:rFonts w:ascii="TH SarabunPSK" w:hAnsi="TH SarabunPSK" w:cs="TH SarabunPSK"/>
+          <w:sz w:val="32"/>
+          <w:szCs w:val="32"/>
+        </w:rPr>
+        <w:t xml:space="preserve">IT Automation), </w:t>
+      </w:r>
+      <w:r>
+        <w:rPr>
+          <w:rFonts w:ascii="TH SarabunPSK" w:hAnsi="TH SarabunPSK" w:cs="TH SarabunPSK"/>
+          <w:sz w:val="32"/>
+          <w:szCs w:val="32"/>
+          <w:cs/>
+        </w:rPr>
+        <w:t>การเขียนโค้ดโปรแกรม ไปจนถึงการทำหน้าที่เป็นผู้ช่วยสนทนา โดยระบบเหล่านี้จะใช้เทคนิคขั้นสูงของโมเดลภาษาขนาดใหญ่ (</w:t>
+      </w:r>
+      <w:r>
+        <w:rPr>
+          <w:rFonts w:ascii="TH SarabunPSK" w:hAnsi="TH SarabunPSK" w:cs="TH SarabunPSK"/>
+          <w:sz w:val="32"/>
+          <w:szCs w:val="32"/>
+        </w:rPr>
+        <w:t xml:space="preserve">LLMs) </w:t>
+      </w:r>
+      <w:r>
+        <w:rPr>
+          <w:rFonts w:ascii="TH SarabunPSK" w:hAnsi="TH SarabunPSK" w:cs="TH SarabunPSK"/>
+          <w:sz w:val="32"/>
+          <w:szCs w:val="32"/>
+          <w:cs/>
+        </w:rPr>
+        <w:t>ในการทำความเข้าใจและตอบสนองต่อคำสั่งของผู้ใช้งานอย่างเป็นลำดับขั้นตอน พร้อมทั้งมีความสามารถในการพิจารณาตัดสินใจได้เองว่าจะเรียกใช้งานเครื่องมือภายนอกเมื่อใดเพื่อให้งานสำเร็จลุล่วง</w:t>
+      </w:r>
+    </w:p>
+    <w:p>
+      <w:pPr>
+        <w:pStyle w:val="font-claude-response-body"/>
+        <w:tabs>
+          <w:tab w:val="left" w:pos="567"/>
+        </w:tabs>
+        <w:spacing w:before="0" w:beforeAutospacing="0" w:after="0" w:afterAutospacing="0"/>
+        <w:jc w:val="thaiDistribute"/>
+        <w:rPr>
+          <w:rFonts w:ascii="TH SarabunPSK" w:hAnsi="TH SarabunPSK" w:cs="TH SarabunPSK"/>
+          <w:sz w:val="32"/>
+          <w:szCs w:val="32"/>
+        </w:rPr>
+      </w:pPr>
+    </w:p>
+    <w:p>
+      <w:pPr>
+        <w:pStyle w:val="font-claude-response-body"/>
+        <w:tabs>
+          <w:tab w:val="left" w:pos="567"/>
+        </w:tabs>
+        <w:spacing w:before="0" w:beforeAutospacing="0" w:after="0" w:afterAutospacing="0"/>
+        <w:jc w:val="thaiDistribute"/>
+        <w:rPr>
+          <w:rFonts w:ascii="TH SarabunPSK" w:hAnsi="TH SarabunPSK" w:cs="TH SarabunPSK"/>
+          <w:sz w:val="32"/>
+          <w:szCs w:val="32"/>
+        </w:rPr>
+      </w:pPr>
+    </w:p>
+    <w:p>
+      <w:pPr>
+        <w:pStyle w:val="font-claude-response-body"/>
+        <w:tabs>
+          <w:tab w:val="left" w:pos="567"/>
+        </w:tabs>
+        <w:spacing w:before="0" w:beforeAutospacing="0" w:after="0" w:afterAutospacing="0"/>
+        <w:jc w:val="thaiDistribute"/>
+        <w:rPr>
+          <w:rFonts w:ascii="TH SarabunPSK" w:hAnsi="TH SarabunPSK" w:cs="TH SarabunPSK"/>
+          <w:sz w:val="32"/>
+          <w:szCs w:val="32"/>
+        </w:rPr>
+      </w:pPr>
+      <w:r>
+        <w:rPr>
+          <w:rFonts w:ascii="TH SarabunPSK" w:hAnsi="TH SarabunPSK" w:cs="TH SarabunPSK"/>
+          <w:sz w:val="32"/>
+          <w:szCs w:val="32"/>
+          <w:cs/>
+        </w:rPr>
+        <w:tab/>
+      </w:r>
+    </w:p>
+    <w:p>
+      <w:pPr>
+        <w:pStyle w:val="font-claude-response-body"/>
+        <w:tabs>
+          <w:tab w:val="left" w:pos="567"/>
+          <w:tab w:val="left" w:pos="1276"/>
+        </w:tabs>
+        <w:spacing w:before="0" w:beforeAutospacing="0" w:after="0" w:afterAutospacing="0"/>
+        <w:jc w:val="thaiDistribute"/>
+        <w:rPr>
+          <w:rFonts w:ascii="TH SarabunPSK" w:hAnsi="TH SarabunPSK" w:cs="TH SarabunPSK"/>
+          <w:sz w:val="32"/>
+          <w:szCs w:val="32"/>
+          <w:cs/>
+        </w:rPr>
+        <w:sectPr>
+          <w:type w:val="continuous"/>
+          <w:pgSz w:w="11906" w:h="16838" w:code="9"/>
+          <w:pgMar w:top="2880" w:right="1440" w:bottom="1440" w:left="2160" w:header="1440" w:footer="720" w:gutter="0"/>
+          <w:pgNumType w:start="5"/>
+          <w:cols w:space="708"/>
+          <w:docGrid w:linePitch="360"/>
+        </w:sectPr>
+      </w:pPr>
+      <w:r>
+        <w:rPr>
+          <w:rFonts w:ascii="TH SarabunPSK" w:hAnsi="TH SarabunPSK" w:cs="TH SarabunPSK"/>
+          <w:sz w:val="32"/>
+          <w:szCs w:val="32"/>
           <w:cs/>
         </w:rPr>
         <w:t xml:space="preserve"> </w:t>
@@ -4544,25 +4568,7 @@
           <w:sz w:val="32"/>
           <w:szCs w:val="32"/>
         </w:rPr>
-        <w:t xml:space="preserve">Input to </w:t>
-      </w:r>
-      <w:proofErr w:type="gramStart"/>
-      <w:r>
-        <w:rPr>
-          <w:rFonts w:ascii="TH SarabunPSK" w:hAnsi="TH SarabunPSK" w:cs="TH SarabunPSK"/>
-          <w:sz w:val="32"/>
-          <w:szCs w:val="32"/>
-        </w:rPr>
-        <w:t>Output :</w:t>
-      </w:r>
-      <w:proofErr w:type="gramEnd"/>
-      <w:r>
-        <w:rPr>
-          <w:rFonts w:ascii="TH SarabunPSK" w:hAnsi="TH SarabunPSK" w:cs="TH SarabunPSK"/>
-          <w:sz w:val="32"/>
-          <w:szCs w:val="32"/>
-        </w:rPr>
-        <w:t xml:space="preserve"> I2O)</w:t>
+        <w:t>Input to Output : I2O)</w:t>
       </w:r>
       <w:r>
         <w:rPr>
@@ -8613,7 +8619,7 @@
         </w:tabs>
         <w:jc w:val="thaiDistribute"/>
         <w:rPr>
-          <w:rFonts w:ascii="TH SarabunPSK" w:hAnsi="TH SarabunPSK" w:cs="TH SarabunPSK"/>
+          <w:rFonts w:ascii="TH SarabunPSK" w:hAnsi="TH SarabunPSK" w:cs="TH SarabunPSK" w:hint="cs"/>
           <w:sz w:val="32"/>
           <w:szCs w:val="32"/>
         </w:rPr>
@@ -8708,30 +8714,6 @@
           <w:rFonts w:ascii="TH SarabunPSK" w:hAnsi="TH SarabunPSK" w:cs="TH SarabunPSK"/>
           <w:sz w:val="32"/>
           <w:szCs w:val="32"/>
-        </w:rPr>
-        <w:tab/>
-      </w:r>
-    </w:p>
-    <w:p>
-      <w:pPr>
-        <w:tabs>
-          <w:tab w:val="left" w:pos="567"/>
-          <w:tab w:val="left" w:pos="1134"/>
-          <w:tab w:val="left" w:pos="1418"/>
-          <w:tab w:val="left" w:pos="1985"/>
-        </w:tabs>
-        <w:jc w:val="thaiDistribute"/>
-        <w:rPr>
-          <w:rFonts w:ascii="TH SarabunPSK" w:hAnsi="TH SarabunPSK" w:cs="TH SarabunPSK"/>
-          <w:sz w:val="32"/>
-          <w:szCs w:val="32"/>
-        </w:rPr>
-      </w:pPr>
-      <w:r>
-        <w:rPr>
-          <w:rFonts w:ascii="TH SarabunPSK" w:hAnsi="TH SarabunPSK" w:cs="TH SarabunPSK"/>
-          <w:sz w:val="32"/>
-          <w:szCs w:val="32"/>
           <w:cs/>
         </w:rPr>
         <w:tab/>
@@ -9832,25 +9814,14 @@
         </w:rPr>
         <w:t>**</w:t>
       </w:r>
-      <w:proofErr w:type="gramStart"/>
-      <w:r>
-        <w:rPr>
-          <w:rFonts w:ascii="TH SarabunPSK" w:hAnsi="TH SarabunPSK" w:cs="TH SarabunPSK"/>
-          <w:sz w:val="32"/>
-          <w:szCs w:val="32"/>
-          <w:cs/>
-        </w:rPr>
-        <w:t>ความเข้ากันได้ข้ามแพลตฟอร์ม :</w:t>
-      </w:r>
-      <w:proofErr w:type="gramEnd"/>
-      <w:r>
-        <w:rPr>
-          <w:rFonts w:ascii="TH SarabunPSK" w:hAnsi="TH SarabunPSK" w:cs="TH SarabunPSK"/>
-          <w:sz w:val="32"/>
-          <w:szCs w:val="32"/>
-          <w:cs/>
-        </w:rPr>
-        <w:t xml:space="preserve"> เว็บแอปสามารถเข้าถึงได้จากอุปกรณ์ใดๆ ที่มีเว็บ</w:t>
+      <w:r>
+        <w:rPr>
+          <w:rFonts w:ascii="TH SarabunPSK" w:hAnsi="TH SarabunPSK" w:cs="TH SarabunPSK"/>
+          <w:sz w:val="32"/>
+          <w:szCs w:val="32"/>
+          <w:cs/>
+        </w:rPr>
+        <w:t>ความเข้ากันได้ข้ามแพลตฟอร์ม : เว็บแอปสามารถเข้าถึงได้จากอุปกรณ์ใดๆ ที่มีเว็บ</w:t>
       </w:r>
       <w:proofErr w:type="spellStart"/>
       <w:r>
@@ -9931,25 +9902,14 @@
         </w:rPr>
         <w:t>**</w:t>
       </w:r>
-      <w:proofErr w:type="gramStart"/>
-      <w:r>
-        <w:rPr>
-          <w:rFonts w:ascii="TH SarabunPSK" w:hAnsi="TH SarabunPSK" w:cs="TH SarabunPSK"/>
-          <w:sz w:val="32"/>
-          <w:szCs w:val="32"/>
-          <w:cs/>
-        </w:rPr>
-        <w:t>ค่าติดตั้งและบำรุงรักษาต่ำ :</w:t>
-      </w:r>
-      <w:proofErr w:type="gramEnd"/>
-      <w:r>
-        <w:rPr>
-          <w:rFonts w:ascii="TH SarabunPSK" w:hAnsi="TH SarabunPSK" w:cs="TH SarabunPSK"/>
-          <w:sz w:val="32"/>
-          <w:szCs w:val="32"/>
-          <w:cs/>
-        </w:rPr>
-        <w:t xml:space="preserve"> เว็บแอปไม่จำเป็นต้องติดตั้ง</w:t>
+      <w:r>
+        <w:rPr>
+          <w:rFonts w:ascii="TH SarabunPSK" w:hAnsi="TH SarabunPSK" w:cs="TH SarabunPSK"/>
+          <w:sz w:val="32"/>
+          <w:szCs w:val="32"/>
+          <w:cs/>
+        </w:rPr>
+        <w:t>ค่าติดตั้งและบำรุงรักษาต่ำ : เว็บแอปไม่จำเป็นต้องติดตั้ง</w:t>
       </w:r>
       <w:proofErr w:type="spellStart"/>
       <w:r>
@@ -10051,25 +10011,14 @@
         </w:rPr>
         <w:t>**</w:t>
       </w:r>
-      <w:proofErr w:type="gramStart"/>
-      <w:r>
-        <w:rPr>
-          <w:rFonts w:ascii="TH SarabunPSK" w:hAnsi="TH SarabunPSK" w:cs="TH SarabunPSK"/>
-          <w:sz w:val="32"/>
-          <w:szCs w:val="32"/>
-          <w:cs/>
-        </w:rPr>
-        <w:t>ความสามารถในการปรับขนาดได้ง่าย :</w:t>
-      </w:r>
-      <w:proofErr w:type="gramEnd"/>
-      <w:r>
-        <w:rPr>
-          <w:rFonts w:ascii="TH SarabunPSK" w:hAnsi="TH SarabunPSK" w:cs="TH SarabunPSK"/>
-          <w:sz w:val="32"/>
-          <w:szCs w:val="32"/>
-          <w:cs/>
-        </w:rPr>
-        <w:t xml:space="preserve"> เว็บแอปสามารถปรับขนาดได้อย่างง่ายดายเพื่อตอบสนองความต้องการของฐานผู้ใช้ที่กำลังเติบโต โดยไม่จำเป็นต้องใช้ฮาร์ดแวร์หรือโครงสร้างพื้นฐานเพิ่มเติม</w:t>
+      <w:r>
+        <w:rPr>
+          <w:rFonts w:ascii="TH SarabunPSK" w:hAnsi="TH SarabunPSK" w:cs="TH SarabunPSK"/>
+          <w:sz w:val="32"/>
+          <w:szCs w:val="32"/>
+          <w:cs/>
+        </w:rPr>
+        <w:t>ความสามารถในการปรับขนาดได้ง่าย : เว็บแอปสามารถปรับขนาดได้อย่างง่ายดายเพื่อตอบสนองความต้องการของฐานผู้ใช้ที่กำลังเติบโต โดยไม่จำเป็นต้องใช้ฮาร์ดแวร์หรือโครงสร้างพื้นฐานเพิ่มเติม</w:t>
       </w:r>
     </w:p>
     <w:p>
@@ -10130,7 +10079,6 @@
         </w:rPr>
         <w:t>**</w:t>
       </w:r>
-      <w:proofErr w:type="gramStart"/>
       <w:r>
         <w:rPr>
           <w:rFonts w:ascii="TH SarabunPSK" w:hAnsi="TH SarabunPSK" w:cs="TH SarabunPSK"/>
@@ -10158,17 +10106,7 @@
           <w:szCs w:val="32"/>
           <w:cs/>
         </w:rPr>
-        <w:t>เดตตามเวลาจริง :</w:t>
-      </w:r>
-      <w:proofErr w:type="gramEnd"/>
-      <w:r>
-        <w:rPr>
-          <w:rFonts w:ascii="TH SarabunPSK" w:hAnsi="TH SarabunPSK" w:cs="TH SarabunPSK"/>
-          <w:sz w:val="32"/>
-          <w:szCs w:val="32"/>
-          <w:cs/>
-        </w:rPr>
-        <w:t xml:space="preserve"> เว็บแอปสามาร</w:t>
+        <w:t>เดตตามเวลาจริง : เว็บแอปสามาร</w:t>
       </w:r>
       <w:proofErr w:type="spellStart"/>
       <w:r>
@@ -10249,25 +10187,14 @@
         </w:rPr>
         <w:t>**</w:t>
       </w:r>
-      <w:proofErr w:type="gramStart"/>
-      <w:r>
-        <w:rPr>
-          <w:rFonts w:ascii="TH SarabunPSK" w:hAnsi="TH SarabunPSK" w:cs="TH SarabunPSK"/>
-          <w:sz w:val="32"/>
-          <w:szCs w:val="32"/>
-          <w:cs/>
-        </w:rPr>
-        <w:t>การทำงานร่วมกันที่ได้รับการปรับปรุง :</w:t>
-      </w:r>
-      <w:proofErr w:type="gramEnd"/>
-      <w:r>
-        <w:rPr>
-          <w:rFonts w:ascii="TH SarabunPSK" w:hAnsi="TH SarabunPSK" w:cs="TH SarabunPSK"/>
-          <w:sz w:val="32"/>
-          <w:szCs w:val="32"/>
-          <w:cs/>
-        </w:rPr>
-        <w:t xml:space="preserve"> เว็บแอปช่วยให้สามารถทำงานร่วมกันแบบเรียลไทม์และแบ่งปันข้อมูลระหว่างผู้ใช้ ปรับปรุงการสื่อสารและประสิทธิภาพการทำงาน</w:t>
+      <w:r>
+        <w:rPr>
+          <w:rFonts w:ascii="TH SarabunPSK" w:hAnsi="TH SarabunPSK" w:cs="TH SarabunPSK"/>
+          <w:sz w:val="32"/>
+          <w:szCs w:val="32"/>
+          <w:cs/>
+        </w:rPr>
+        <w:t>การทำงานร่วมกันที่ได้รับการปรับปรุง : เว็บแอปช่วยให้สามารถทำงานร่วมกันแบบเรียลไทม์และแบ่งปันข้อมูลระหว่างผู้ใช้ ปรับปรุงการสื่อสารและประสิทธิภาพการทำงาน</w:t>
       </w:r>
     </w:p>
     <w:p>
@@ -10414,25 +10341,14 @@
         </w:rPr>
         <w:t>**</w:t>
       </w:r>
-      <w:proofErr w:type="gramStart"/>
-      <w:r>
-        <w:rPr>
-          <w:rFonts w:ascii="TH SarabunPSK" w:hAnsi="TH SarabunPSK" w:cs="TH SarabunPSK"/>
-          <w:sz w:val="32"/>
-          <w:szCs w:val="32"/>
-          <w:cs/>
-        </w:rPr>
-        <w:t>การพึ่งพาอินเทอร์เน็ต :</w:t>
-      </w:r>
-      <w:proofErr w:type="gramEnd"/>
-      <w:r>
-        <w:rPr>
-          <w:rFonts w:ascii="TH SarabunPSK" w:hAnsi="TH SarabunPSK" w:cs="TH SarabunPSK"/>
-          <w:sz w:val="32"/>
-          <w:szCs w:val="32"/>
-          <w:cs/>
-        </w:rPr>
-        <w:t xml:space="preserve"> เว็บแอปจำเป็นต้องมีการเชื่อมต่ออินเทอร์เน็ตจึงจะทำงานได้ ทำให้ไม่สามารถใช้งานได้ในโหมดออฟไลน์หรือพื้นที่ที่มีการเชื่อมต่อเครือข่ายไม่ดี</w:t>
+      <w:r>
+        <w:rPr>
+          <w:rFonts w:ascii="TH SarabunPSK" w:hAnsi="TH SarabunPSK" w:cs="TH SarabunPSK"/>
+          <w:sz w:val="32"/>
+          <w:szCs w:val="32"/>
+          <w:cs/>
+        </w:rPr>
+        <w:t>การพึ่งพาอินเทอร์เน็ต : เว็บแอปจำเป็นต้องมีการเชื่อมต่ออินเทอร์เน็ตจึงจะทำงานได้ ทำให้ไม่สามารถใช้งานได้ในโหมดออฟไลน์หรือพื้นที่ที่มีการเชื่อมต่อเครือข่ายไม่ดี</w:t>
       </w:r>
     </w:p>
     <w:p>
@@ -10493,25 +10409,14 @@
         </w:rPr>
         <w:t>**</w:t>
       </w:r>
-      <w:proofErr w:type="gramStart"/>
-      <w:r>
-        <w:rPr>
-          <w:rFonts w:ascii="TH SarabunPSK" w:hAnsi="TH SarabunPSK" w:cs="TH SarabunPSK"/>
-          <w:sz w:val="32"/>
-          <w:szCs w:val="32"/>
-          <w:cs/>
-        </w:rPr>
-        <w:t>ความเสี่ยงด้านความปลอดภัย :</w:t>
-      </w:r>
-      <w:proofErr w:type="gramEnd"/>
-      <w:r>
-        <w:rPr>
-          <w:rFonts w:ascii="TH SarabunPSK" w:hAnsi="TH SarabunPSK" w:cs="TH SarabunPSK"/>
-          <w:sz w:val="32"/>
-          <w:szCs w:val="32"/>
-          <w:cs/>
-        </w:rPr>
-        <w:t xml:space="preserve"> เว็บแอปมีความเสี่ยงต่อภัยคุกคามความปลอดภัย เช่น การละเมิดข้อมูล การโจมตีแบบ</w:t>
+      <w:r>
+        <w:rPr>
+          <w:rFonts w:ascii="TH SarabunPSK" w:hAnsi="TH SarabunPSK" w:cs="TH SarabunPSK"/>
+          <w:sz w:val="32"/>
+          <w:szCs w:val="32"/>
+          <w:cs/>
+        </w:rPr>
+        <w:t>ความเสี่ยงด้านความปลอดภัย : เว็บแอปมีความเสี่ยงต่อภัยคุกคามความปลอดภัย เช่น การละเมิดข้อมูล การโจมตีแบบ</w:t>
       </w:r>
       <w:proofErr w:type="spellStart"/>
       <w:r>
@@ -10620,25 +10525,14 @@
         </w:rPr>
         <w:t>**</w:t>
       </w:r>
-      <w:proofErr w:type="gramStart"/>
-      <w:r>
-        <w:rPr>
-          <w:rFonts w:ascii="TH SarabunPSK" w:hAnsi="TH SarabunPSK" w:cs="TH SarabunPSK"/>
-          <w:sz w:val="32"/>
-          <w:szCs w:val="32"/>
-          <w:cs/>
-        </w:rPr>
-        <w:t>ข้อจำกัดด้านประสิทธิภาพ :</w:t>
-      </w:r>
-      <w:proofErr w:type="gramEnd"/>
-      <w:r>
-        <w:rPr>
-          <w:rFonts w:ascii="TH SarabunPSK" w:hAnsi="TH SarabunPSK" w:cs="TH SarabunPSK"/>
-          <w:sz w:val="32"/>
-          <w:szCs w:val="32"/>
-          <w:cs/>
-        </w:rPr>
-        <w:t xml:space="preserve"> เว็บแอปอาจประสบปัญหาข้อจำกัดด้านประสิทธิภาพเนื่องจากปัจจัยต่างๆ เช่น การเชื่อมต่อเครือข่ายที่ช้า ปัญหาความเข้ากันได้ของ</w:t>
+      <w:r>
+        <w:rPr>
+          <w:rFonts w:ascii="TH SarabunPSK" w:hAnsi="TH SarabunPSK" w:cs="TH SarabunPSK"/>
+          <w:sz w:val="32"/>
+          <w:szCs w:val="32"/>
+          <w:cs/>
+        </w:rPr>
+        <w:t>ข้อจำกัดด้านประสิทธิภาพ : เว็บแอปอาจประสบปัญหาข้อจำกัดด้านประสิทธิภาพเนื่องจากปัจจัยต่างๆ เช่น การเชื่อมต่อเครือข่ายที่ช้า ปัญหาความเข้ากันได้ของ</w:t>
       </w:r>
       <w:proofErr w:type="spellStart"/>
       <w:r>
@@ -10719,25 +10613,14 @@
         </w:rPr>
         <w:t>**</w:t>
       </w:r>
-      <w:proofErr w:type="gramStart"/>
-      <w:r>
-        <w:rPr>
-          <w:rFonts w:ascii="TH SarabunPSK" w:hAnsi="TH SarabunPSK" w:cs="TH SarabunPSK"/>
-          <w:sz w:val="32"/>
-          <w:szCs w:val="32"/>
-          <w:cs/>
-        </w:rPr>
-        <w:t>ฟังก์ชันการทำงานที่จำกัด :</w:t>
-      </w:r>
-      <w:proofErr w:type="gramEnd"/>
-      <w:r>
-        <w:rPr>
-          <w:rFonts w:ascii="TH SarabunPSK" w:hAnsi="TH SarabunPSK" w:cs="TH SarabunPSK"/>
-          <w:sz w:val="32"/>
-          <w:szCs w:val="32"/>
-          <w:cs/>
-        </w:rPr>
-        <w:t xml:space="preserve"> เว็บแอปอาจมีระดับฟังก์ชันการทำงานที่แตกต่างจากแอปพลิเคชัน</w:t>
+      <w:r>
+        <w:rPr>
+          <w:rFonts w:ascii="TH SarabunPSK" w:hAnsi="TH SarabunPSK" w:cs="TH SarabunPSK"/>
+          <w:sz w:val="32"/>
+          <w:szCs w:val="32"/>
+          <w:cs/>
+        </w:rPr>
+        <w:t>ฟังก์ชันการทำงานที่จำกัด : เว็บแอปอาจมีระดับฟังก์ชันการทำงานที่แตกต่างจากแอปพลิเคชัน</w:t>
       </w:r>
       <w:proofErr w:type="spellStart"/>
       <w:r>
@@ -10818,7 +10701,6 @@
         </w:rPr>
         <w:t>**</w:t>
       </w:r>
-      <w:proofErr w:type="gramStart"/>
       <w:r>
         <w:rPr>
           <w:rFonts w:ascii="TH SarabunPSK" w:hAnsi="TH SarabunPSK" w:cs="TH SarabunPSK"/>
@@ -10846,17 +10728,7 @@
           <w:szCs w:val="32"/>
           <w:cs/>
         </w:rPr>
-        <w:t>ราว์เซอร์ :</w:t>
-      </w:r>
-      <w:proofErr w:type="gramEnd"/>
-      <w:r>
-        <w:rPr>
-          <w:rFonts w:ascii="TH SarabunPSK" w:hAnsi="TH SarabunPSK" w:cs="TH SarabunPSK"/>
-          <w:sz w:val="32"/>
-          <w:szCs w:val="32"/>
-          <w:cs/>
-        </w:rPr>
-        <w:t xml:space="preserve"> เว็บแอปอาจทำงานไม่ถูกต้องบนเว็บ</w:t>
+        <w:t>ราว์เซอร์ : เว็บแอปอาจทำงานไม่ถูกต้องบนเว็บ</w:t>
       </w:r>
       <w:proofErr w:type="spellStart"/>
       <w:r>
@@ -11059,25 +10931,14 @@
         </w:rPr>
         <w:t>**</w:t>
       </w:r>
-      <w:proofErr w:type="gramStart"/>
-      <w:r>
-        <w:rPr>
-          <w:rFonts w:ascii="TH SarabunPSK" w:hAnsi="TH SarabunPSK" w:cs="TH SarabunPSK"/>
-          <w:sz w:val="32"/>
-          <w:szCs w:val="32"/>
-          <w:cs/>
-        </w:rPr>
-        <w:t>เว็บแอปแบบคงที่ :</w:t>
-      </w:r>
-      <w:proofErr w:type="gramEnd"/>
-      <w:r>
-        <w:rPr>
-          <w:rFonts w:ascii="TH SarabunPSK" w:hAnsi="TH SarabunPSK" w:cs="TH SarabunPSK"/>
-          <w:sz w:val="32"/>
-          <w:szCs w:val="32"/>
-          <w:cs/>
-        </w:rPr>
-        <w:t xml:space="preserve"> เป็นเว็บแอปธรรมดาที่ไม่ต้องใช้การประมวลผลฝั่ง</w:t>
+      <w:r>
+        <w:rPr>
+          <w:rFonts w:ascii="TH SarabunPSK" w:hAnsi="TH SarabunPSK" w:cs="TH SarabunPSK"/>
+          <w:sz w:val="32"/>
+          <w:szCs w:val="32"/>
+          <w:cs/>
+        </w:rPr>
+        <w:t>เว็บแอปแบบคงที่ : เป็นเว็บแอปธรรมดาที่ไม่ต้องใช้การประมวลผลฝั่ง</w:t>
       </w:r>
       <w:proofErr w:type="spellStart"/>
       <w:r>
@@ -11210,7 +11071,6 @@
         </w:rPr>
         <w:t>**</w:t>
       </w:r>
-      <w:proofErr w:type="gramStart"/>
       <w:r>
         <w:rPr>
           <w:rFonts w:ascii="TH SarabunPSK" w:hAnsi="TH SarabunPSK" w:cs="TH SarabunPSK"/>
@@ -11258,17 +11118,7 @@
           <w:szCs w:val="32"/>
           <w:cs/>
         </w:rPr>
-        <w:t xml:space="preserve"> :</w:t>
-      </w:r>
-      <w:proofErr w:type="gramEnd"/>
-      <w:r>
-        <w:rPr>
-          <w:rFonts w:ascii="TH SarabunPSK" w:hAnsi="TH SarabunPSK" w:cs="TH SarabunPSK"/>
-          <w:sz w:val="32"/>
-          <w:szCs w:val="32"/>
-          <w:cs/>
-        </w:rPr>
-        <w:t xml:space="preserve"> เว็บแอปเหล่านี้ใช้สคริปต์ฝั่ง</w:t>
+        <w:t xml:space="preserve"> : เว็บแอปเหล่านี้ใช้สคริปต์ฝั่ง</w:t>
       </w:r>
       <w:proofErr w:type="spellStart"/>
       <w:r>
@@ -11487,25 +11337,7 @@
           <w:sz w:val="32"/>
           <w:szCs w:val="32"/>
         </w:rPr>
-        <w:t>SPA</w:t>
-      </w:r>
-      <w:proofErr w:type="gramStart"/>
-      <w:r>
-        <w:rPr>
-          <w:rFonts w:ascii="TH SarabunPSK" w:hAnsi="TH SarabunPSK" w:cs="TH SarabunPSK"/>
-          <w:sz w:val="32"/>
-          <w:szCs w:val="32"/>
-        </w:rPr>
-        <w:t>) :</w:t>
-      </w:r>
-      <w:proofErr w:type="gramEnd"/>
-      <w:r>
-        <w:rPr>
-          <w:rFonts w:ascii="TH SarabunPSK" w:hAnsi="TH SarabunPSK" w:cs="TH SarabunPSK"/>
-          <w:sz w:val="32"/>
-          <w:szCs w:val="32"/>
-        </w:rPr>
-        <w:t xml:space="preserve"> </w:t>
+        <w:t xml:space="preserve">SPA) : </w:t>
       </w:r>
       <w:r>
         <w:rPr>
@@ -11693,25 +11525,7 @@
           <w:sz w:val="32"/>
           <w:szCs w:val="32"/>
         </w:rPr>
-        <w:t>Progressive Web Applications (PWA</w:t>
-      </w:r>
-      <w:proofErr w:type="gramStart"/>
-      <w:r>
-        <w:rPr>
-          <w:rFonts w:ascii="TH SarabunPSK" w:hAnsi="TH SarabunPSK" w:cs="TH SarabunPSK"/>
-          <w:sz w:val="32"/>
-          <w:szCs w:val="32"/>
-        </w:rPr>
-        <w:t>) :</w:t>
-      </w:r>
-      <w:proofErr w:type="gramEnd"/>
-      <w:r>
-        <w:rPr>
-          <w:rFonts w:ascii="TH SarabunPSK" w:hAnsi="TH SarabunPSK" w:cs="TH SarabunPSK"/>
-          <w:sz w:val="32"/>
-          <w:szCs w:val="32"/>
-        </w:rPr>
-        <w:t xml:space="preserve"> PWA </w:t>
+        <w:t xml:space="preserve">Progressive Web Applications (PWA) : PWA </w:t>
       </w:r>
       <w:r>
         <w:rPr>
@@ -11800,25 +11614,14 @@
         </w:rPr>
         <w:t>**</w:t>
       </w:r>
-      <w:proofErr w:type="gramStart"/>
-      <w:r>
-        <w:rPr>
-          <w:rFonts w:ascii="TH SarabunPSK" w:hAnsi="TH SarabunPSK" w:cs="TH SarabunPSK"/>
-          <w:sz w:val="32"/>
-          <w:szCs w:val="32"/>
-          <w:cs/>
-        </w:rPr>
-        <w:t>บริการทางเว็บ :</w:t>
-      </w:r>
-      <w:proofErr w:type="gramEnd"/>
-      <w:r>
-        <w:rPr>
-          <w:rFonts w:ascii="TH SarabunPSK" w:hAnsi="TH SarabunPSK" w:cs="TH SarabunPSK"/>
-          <w:sz w:val="32"/>
-          <w:szCs w:val="32"/>
-          <w:cs/>
-        </w:rPr>
-        <w:t xml:space="preserve"> เว็บแอปเหล่านี้มีชุด </w:t>
+      <w:r>
+        <w:rPr>
+          <w:rFonts w:ascii="TH SarabunPSK" w:hAnsi="TH SarabunPSK" w:cs="TH SarabunPSK"/>
+          <w:sz w:val="32"/>
+          <w:szCs w:val="32"/>
+          <w:cs/>
+        </w:rPr>
+        <w:t xml:space="preserve">บริการทางเว็บ : เว็บแอปเหล่านี้มีชุด </w:t>
       </w:r>
       <w:r>
         <w:rPr>
@@ -11931,7 +11734,6 @@
         </w:rPr>
         <w:t>**</w:t>
       </w:r>
-      <w:proofErr w:type="gramStart"/>
       <w:r>
         <w:rPr>
           <w:rFonts w:ascii="TH SarabunPSK" w:hAnsi="TH SarabunPSK" w:cs="TH SarabunPSK"/>
@@ -11959,17 +11761,7 @@
           <w:szCs w:val="32"/>
           <w:cs/>
         </w:rPr>
-        <w:t xml:space="preserve"> :</w:t>
-      </w:r>
-      <w:proofErr w:type="gramEnd"/>
-      <w:r>
-        <w:rPr>
-          <w:rFonts w:ascii="TH SarabunPSK" w:hAnsi="TH SarabunPSK" w:cs="TH SarabunPSK"/>
-          <w:sz w:val="32"/>
-          <w:szCs w:val="32"/>
-          <w:cs/>
-        </w:rPr>
-        <w:t xml:space="preserve"> เว็บแอปพลิเคชันเหล่านี้มอบเกตเวย์แบบรวมไปยังแหล่งข้อมูลที่แตกต่างกัน เช่น ข่าวสาร อีเมล และโซ</w:t>
+        <w:t xml:space="preserve"> : เว็บแอปพลิเคชันเหล่านี้มอบเกตเวย์แบบรวมไปยังแหล่งข้อมูลที่แตกต่างกัน เช่น ข่าวสาร อีเมล และโซ</w:t>
       </w:r>
       <w:proofErr w:type="spellStart"/>
       <w:r>
@@ -12256,6 +12048,7 @@
         </w:rPr>
         <w:t>.1</w:t>
       </w:r>
+      <w:bookmarkStart w:id="6" w:name="_Hlk228199640"/>
       <w:r>
         <w:rPr>
           <w:rFonts w:ascii="TH SarabunPSK" w:hAnsi="TH SarabunPSK" w:cs="TH SarabunPSK"/>
@@ -12292,6 +12085,7 @@
         </w:rPr>
         <w:t xml:space="preserve"> </w:t>
       </w:r>
+      <w:bookmarkEnd w:id="6"/>
       <w:r>
         <w:rPr>
           <w:rFonts w:ascii="TH SarabunPSK" w:hAnsi="TH SarabunPSK" w:cs="TH SarabunPSK"/>
@@ -12300,7 +12094,7 @@
         </w:rPr>
         <w:t>(</w:t>
       </w:r>
-      <w:bookmarkStart w:id="6" w:name="_Hlk177048191"/>
+      <w:bookmarkStart w:id="7" w:name="_Hlk177048191"/>
       <w:proofErr w:type="spellStart"/>
       <w:r>
         <w:rPr>
@@ -12310,7 +12104,7 @@
         </w:rPr>
         <w:t>GaMeDeV</w:t>
       </w:r>
-      <w:bookmarkEnd w:id="6"/>
+      <w:bookmarkEnd w:id="7"/>
       <w:proofErr w:type="spellEnd"/>
       <w:r>
         <w:rPr>
@@ -12496,7 +12290,7 @@
           <w:szCs w:val="32"/>
         </w:rPr>
       </w:pPr>
-      <w:bookmarkStart w:id="7" w:name="_Hlk217307227"/>
+      <w:bookmarkStart w:id="8" w:name="_Hlk217307227"/>
       <w:r>
         <w:rPr>
           <w:rFonts w:ascii="TH SarabunPSK" w:hAnsi="TH SarabunPSK" w:cs="TH SarabunPSK" w:hint="cs"/>
@@ -12607,7 +12401,7 @@
         </w:rPr>
       </w:pPr>
     </w:p>
-    <w:bookmarkEnd w:id="7"/>
+    <w:bookmarkEnd w:id="8"/>
     <w:p>
       <w:pPr>
         <w:tabs>
@@ -14096,25 +13890,14 @@
         </w:rPr>
         <w:t xml:space="preserve">Extensions </w:t>
       </w:r>
-      <w:proofErr w:type="gramStart"/>
-      <w:r>
-        <w:rPr>
-          <w:rFonts w:ascii="TH SarabunPSK" w:hAnsi="TH SarabunPSK" w:cs="TH SarabunPSK"/>
-          <w:sz w:val="32"/>
-          <w:szCs w:val="32"/>
-          <w:cs/>
-        </w:rPr>
-        <w:t>นั้นจะเป็นการโหลดมาใช้แบบฟรี !</w:t>
-      </w:r>
-      <w:proofErr w:type="gramEnd"/>
-      <w:r>
-        <w:rPr>
-          <w:rFonts w:ascii="TH SarabunPSK" w:hAnsi="TH SarabunPSK" w:cs="TH SarabunPSK"/>
-          <w:sz w:val="32"/>
-          <w:szCs w:val="32"/>
-          <w:cs/>
-        </w:rPr>
-        <w:t xml:space="preserve"> และ ขั้นตอนการโหลดที่ไม่ยุ่งยากด้วย ก่อนอื่นเลยมาดูวิธีการดาวน์โหลดกัน</w:t>
+      <w:r>
+        <w:rPr>
+          <w:rFonts w:ascii="TH SarabunPSK" w:hAnsi="TH SarabunPSK" w:cs="TH SarabunPSK"/>
+          <w:sz w:val="32"/>
+          <w:szCs w:val="32"/>
+          <w:cs/>
+        </w:rPr>
+        <w:t>นั้นจะเป็นการโหลดมาใช้แบบฟรี ! และ ขั้นตอนการโหลดที่ไม่ยุ่งยากด้วย ก่อนอื่นเลยมาดูวิธีการดาวน์โหลดกัน</w:t>
       </w:r>
       <w:r>
         <w:rPr>
@@ -15095,7 +14878,6 @@
         <w:t>(</w:t>
       </w:r>
       <w:proofErr w:type="spellStart"/>
-      <w:proofErr w:type="gramStart"/>
       <w:r>
         <w:rPr>
           <w:rFonts w:ascii="TH SarabunPSK" w:hAnsi="TH SarabunPSK" w:cs="TH SarabunPSK"/>
@@ -15105,7 +14887,6 @@
         <w:t>codinggun</w:t>
       </w:r>
       <w:proofErr w:type="spellEnd"/>
-      <w:proofErr w:type="gramEnd"/>
       <w:r>
         <w:rPr>
           <w:rFonts w:ascii="TH SarabunPSK" w:hAnsi="TH SarabunPSK" w:cs="TH SarabunPSK"/>
@@ -16045,7 +15826,6 @@
         <w:t>(</w:t>
       </w:r>
       <w:proofErr w:type="spellStart"/>
-      <w:proofErr w:type="gramStart"/>
       <w:r>
         <w:rPr>
           <w:rFonts w:ascii="TH SarabunPSK" w:hAnsi="TH SarabunPSK" w:cs="TH SarabunPSK"/>
@@ -16055,7 +15835,6 @@
         <w:t>iplandigital</w:t>
       </w:r>
       <w:proofErr w:type="spellEnd"/>
-      <w:proofErr w:type="gramEnd"/>
       <w:r>
         <w:rPr>
           <w:rFonts w:ascii="TH SarabunPSK" w:hAnsi="TH SarabunPSK" w:cs="TH SarabunPSK"/>
@@ -17113,7 +16892,6 @@
         </w:rPr>
         <w:t xml:space="preserve"> (</w:t>
       </w:r>
-      <w:proofErr w:type="gramStart"/>
       <w:r>
         <w:rPr>
           <w:rFonts w:ascii="TH SarabunPSK" w:hAnsi="TH SarabunPSK" w:cs="TH SarabunPSK"/>
@@ -17122,7 +16900,6 @@
         </w:rPr>
         <w:t>nipa</w:t>
       </w:r>
-      <w:proofErr w:type="gramEnd"/>
       <w:r>
         <w:rPr>
           <w:rFonts w:ascii="TH SarabunPSK" w:hAnsi="TH SarabunPSK" w:cs="TH SarabunPSK"/>
@@ -19920,6 +19697,7 @@
         </w:rPr>
         <w:t>**</w:t>
       </w:r>
+      <w:bookmarkStart w:id="9" w:name="_Hlk228203544"/>
       <w:r>
         <w:rPr>
           <w:rFonts w:ascii="TH SarabunPSK" w:hAnsi="TH SarabunPSK" w:cs="TH SarabunPSK"/>
@@ -19937,6 +19715,7 @@
         </w:rPr>
         <w:t>คืออะไร</w:t>
       </w:r>
+      <w:bookmarkEnd w:id="9"/>
       <w:r>
         <w:rPr>
           <w:rFonts w:ascii="TH SarabunPSK" w:hAnsi="TH SarabunPSK" w:cs="TH SarabunPSK" w:hint="cs"/>
@@ -20646,6 +20425,7 @@
         </w:rPr>
         <w:t>**</w:t>
       </w:r>
+      <w:bookmarkStart w:id="10" w:name="_Hlk228203793"/>
       <w:r>
         <w:rPr>
           <w:rFonts w:ascii="TH SarabunPSK" w:hAnsi="TH SarabunPSK" w:cs="TH SarabunPSK"/>
@@ -20673,6 +20453,7 @@
         </w:rPr>
         <w:t xml:space="preserve"> Functions</w:t>
       </w:r>
+      <w:bookmarkEnd w:id="10"/>
       <w:r>
         <w:rPr>
           <w:rFonts w:ascii="TH SarabunPSK" w:hAnsi="TH SarabunPSK" w:cs="TH SarabunPSK"/>
@@ -21459,6 +21240,7 @@
         </w:rPr>
         <w:t>**</w:t>
       </w:r>
+      <w:bookmarkStart w:id="11" w:name="_Hlk228204545"/>
       <w:proofErr w:type="spellStart"/>
       <w:r>
         <w:rPr>
@@ -21486,6 +21268,7 @@
         </w:rPr>
         <w:t>คืออะไร</w:t>
       </w:r>
+      <w:bookmarkEnd w:id="11"/>
       <w:r>
         <w:rPr>
           <w:rFonts w:ascii="TH SarabunPSK" w:hAnsi="TH SarabunPSK" w:cs="TH SarabunPSK" w:hint="cs"/>
@@ -22263,7 +22046,6 @@
         <w:t xml:space="preserve"> (</w:t>
       </w:r>
       <w:proofErr w:type="spellStart"/>
-      <w:proofErr w:type="gramStart"/>
       <w:r>
         <w:rPr>
           <w:rFonts w:ascii="TH SarabunPSK" w:hAnsi="TH SarabunPSK" w:cs="TH SarabunPSK"/>
@@ -22273,7 +22055,6 @@
         <w:t>knmasters</w:t>
       </w:r>
       <w:proofErr w:type="spellEnd"/>
-      <w:proofErr w:type="gramEnd"/>
       <w:r>
         <w:rPr>
           <w:rFonts w:ascii="TH SarabunPSK" w:hAnsi="TH SarabunPSK" w:cs="TH SarabunPSK"/>
@@ -24421,6 +24202,7 @@
         </w:rPr>
         <w:t>**</w:t>
       </w:r>
+      <w:bookmarkStart w:id="12" w:name="_Hlk228205694"/>
       <w:r>
         <w:rPr>
           <w:rFonts w:ascii="TH SarabunPSK" w:hAnsi="TH SarabunPSK" w:cs="TH SarabunPSK"/>
@@ -24438,6 +24220,7 @@
         </w:rPr>
         <w:t>คืออะไร</w:t>
       </w:r>
+      <w:bookmarkEnd w:id="12"/>
       <w:r>
         <w:rPr>
           <w:rFonts w:ascii="TH SarabunPSK" w:hAnsi="TH SarabunPSK" w:cs="TH SarabunPSK"/>
@@ -25441,6 +25224,7 @@
         </w:rPr>
         <w:t>**</w:t>
       </w:r>
+      <w:bookmarkStart w:id="13" w:name="_Hlk228206139"/>
       <w:r>
         <w:rPr>
           <w:rFonts w:ascii="TH SarabunPSK" w:hAnsi="TH SarabunPSK" w:cs="TH SarabunPSK"/>
@@ -25456,7 +25240,17 @@
           <w:szCs w:val="32"/>
           <w:cs/>
         </w:rPr>
-        <w:t xml:space="preserve"> คืออะไร </w:t>
+        <w:t xml:space="preserve"> คืออะไร</w:t>
+      </w:r>
+      <w:bookmarkEnd w:id="13"/>
+      <w:r>
+        <w:rPr>
+          <w:rFonts w:ascii="TH SarabunPSK" w:hAnsi="TH SarabunPSK" w:cs="TH SarabunPSK" w:hint="cs"/>
+          <w:sz w:val="32"/>
+          <w:szCs w:val="32"/>
+          <w:cs/>
+        </w:rPr>
+        <w:t xml:space="preserve"> </w:t>
       </w:r>
       <w:r>
         <w:rPr>
@@ -26511,6 +26305,7 @@
         </w:rPr>
         <w:t>**</w:t>
       </w:r>
+      <w:bookmarkStart w:id="14" w:name="_Hlk228206671"/>
       <w:r>
         <w:rPr>
           <w:rFonts w:ascii="TH SarabunPSK" w:hAnsi="TH SarabunPSK" w:cs="TH SarabunPSK"/>
@@ -26536,6 +26331,7 @@
         </w:rPr>
         <w:t>?</w:t>
       </w:r>
+      <w:bookmarkEnd w:id="14"/>
       <w:r>
         <w:rPr>
           <w:rFonts w:ascii="TH SarabunPSK" w:hAnsi="TH SarabunPSK" w:cs="TH SarabunPSK"/>
@@ -26545,7 +26341,6 @@
         <w:t xml:space="preserve"> (</w:t>
       </w:r>
       <w:proofErr w:type="spellStart"/>
-      <w:proofErr w:type="gramStart"/>
       <w:r>
         <w:rPr>
           <w:rFonts w:ascii="TH SarabunPSK" w:hAnsi="TH SarabunPSK" w:cs="TH SarabunPSK"/>
@@ -26555,7 +26350,6 @@
         <w:t>davoy.tech</w:t>
       </w:r>
       <w:proofErr w:type="spellEnd"/>
-      <w:proofErr w:type="gramEnd"/>
       <w:r>
         <w:rPr>
           <w:rFonts w:ascii="TH SarabunPSK" w:hAnsi="TH SarabunPSK" w:cs="TH SarabunPSK"/>
@@ -26726,7 +26520,7 @@
           <w:szCs w:val="32"/>
         </w:rPr>
       </w:pPr>
-      <w:bookmarkStart w:id="8" w:name="_Hlk222279560"/>
+      <w:bookmarkStart w:id="15" w:name="_Hlk222279560"/>
       <w:r>
         <w:rPr>
           <w:rFonts w:ascii="TH SarabunPSK" w:hAnsi="TH SarabunPSK" w:cs="TH SarabunPSK" w:hint="cs"/>
@@ -26770,7 +26564,7 @@
         <w:t xml:space="preserve"> Logo</w:t>
       </w:r>
     </w:p>
-    <w:bookmarkEnd w:id="8"/>
+    <w:bookmarkEnd w:id="15"/>
     <w:p>
       <w:pPr>
         <w:tabs>
@@ -28529,7 +28323,6 @@
         <w:t>(</w:t>
       </w:r>
       <w:proofErr w:type="spellStart"/>
-      <w:proofErr w:type="gramStart"/>
       <w:r>
         <w:rPr>
           <w:rFonts w:ascii="TH SarabunPSK" w:hAnsi="TH SarabunPSK" w:cs="TH SarabunPSK"/>
@@ -28539,7 +28332,6 @@
         <w:t>learn.prompt</w:t>
       </w:r>
       <w:proofErr w:type="spellEnd"/>
-      <w:proofErr w:type="gramEnd"/>
       <w:r>
         <w:rPr>
           <w:rFonts w:ascii="TH SarabunPSK" w:hAnsi="TH SarabunPSK" w:cs="TH SarabunPSK"/>
@@ -31119,6 +30911,7 @@
         </w:rPr>
         <w:t>**</w:t>
       </w:r>
+      <w:bookmarkStart w:id="16" w:name="_Hlk228207926"/>
       <w:r>
         <w:rPr>
           <w:rFonts w:ascii="TH SarabunPSK" w:hAnsi="TH SarabunPSK" w:cs="TH SarabunPSK"/>
@@ -31128,7 +30921,19 @@
           <w:szCs w:val="32"/>
           <w:cs/>
         </w:rPr>
-        <w:t>ทฤษฎีการสร้างข้อความด้วยการค้นคืนสารสนเทศ (</w:t>
+        <w:t>ทฤษฎีการสร้างข้อความด้วยการค้นคืนสารสนเทศ</w:t>
+      </w:r>
+      <w:bookmarkEnd w:id="16"/>
+      <w:r>
+        <w:rPr>
+          <w:rFonts w:ascii="TH SarabunPSK" w:hAnsi="TH SarabunPSK" w:cs="TH SarabunPSK"/>
+          <w:b/>
+          <w:bCs/>
+          <w:sz w:val="32"/>
+          <w:szCs w:val="32"/>
+          <w:cs/>
+        </w:rPr>
+        <w:t xml:space="preserve"> (</w:t>
       </w:r>
       <w:r>
         <w:rPr>
@@ -36706,14 +36511,25 @@
         </w:rPr>
         <w:tab/>
       </w:r>
-      <w:r>
-        <w:rPr>
-          <w:rFonts w:ascii="TH SarabunPSK" w:hAnsi="TH SarabunPSK" w:cs="TH SarabunPSK"/>
-          <w:sz w:val="32"/>
-          <w:szCs w:val="32"/>
-          <w:cs/>
-        </w:rPr>
-        <w:t>อภิญญา แขนสูงเนิน (</w:t>
+      <w:bookmarkStart w:id="17" w:name="_Hlk228210291"/>
+      <w:r>
+        <w:rPr>
+          <w:rFonts w:ascii="TH SarabunPSK" w:hAnsi="TH SarabunPSK" w:cs="TH SarabunPSK"/>
+          <w:sz w:val="32"/>
+          <w:szCs w:val="32"/>
+          <w:cs/>
+        </w:rPr>
+        <w:t xml:space="preserve">อภิญญา แขนสูงเนิน </w:t>
+      </w:r>
+      <w:bookmarkEnd w:id="17"/>
+      <w:r>
+        <w:rPr>
+          <w:rFonts w:ascii="TH SarabunPSK" w:hAnsi="TH SarabunPSK" w:cs="TH SarabunPSK"/>
+          <w:sz w:val="32"/>
+          <w:szCs w:val="32"/>
+          <w:cs/>
+        </w:rPr>
+        <w:t>(</w:t>
       </w:r>
       <w:r>
         <w:rPr>
@@ -36905,6 +36721,7 @@
         </w:rPr>
         <w:tab/>
       </w:r>
+      <w:bookmarkStart w:id="18" w:name="_Hlk228211461"/>
       <w:proofErr w:type="spellStart"/>
       <w:r>
         <w:rPr>
@@ -36947,14 +36764,25 @@
           <w:szCs w:val="32"/>
           <w:cs/>
         </w:rPr>
-        <w:t xml:space="preserve"> และ คณะ (2567) ได้ทำการศึกษาเรื่อง การพัฒนา </w:t>
-      </w:r>
+        <w:t xml:space="preserve"> และ คณะ</w:t>
+      </w:r>
+      <w:bookmarkEnd w:id="18"/>
       <w:r>
         <w:rPr>
           <w:rFonts w:ascii="TH SarabunPSK" w:hAnsi="TH SarabunPSK" w:cs="TH SarabunPSK"/>
           <w:color w:val="000000" w:themeColor="text1"/>
           <w:sz w:val="32"/>
           <w:szCs w:val="32"/>
+          <w:cs/>
+        </w:rPr>
+        <w:t xml:space="preserve"> (2567) ได้ทำการศึกษาเรื่อง การพัฒนา </w:t>
+      </w:r>
+      <w:r>
+        <w:rPr>
+          <w:rFonts w:ascii="TH SarabunPSK" w:hAnsi="TH SarabunPSK" w:cs="TH SarabunPSK"/>
+          <w:color w:val="000000" w:themeColor="text1"/>
+          <w:sz w:val="32"/>
+          <w:szCs w:val="32"/>
         </w:rPr>
         <w:t xml:space="preserve">Chatbot AI </w:t>
       </w:r>
@@ -37090,6 +36918,7 @@
         </w:rPr>
         <w:tab/>
       </w:r>
+      <w:bookmarkStart w:id="19" w:name="_Hlk228212577"/>
       <w:r>
         <w:rPr>
           <w:rFonts w:ascii="TH SarabunPSK" w:hAnsi="TH SarabunPSK" w:cs="TH SarabunPSK"/>
@@ -37120,14 +36949,25 @@
           <w:szCs w:val="32"/>
           <w:cs/>
         </w:rPr>
-        <w:t xml:space="preserve"> และ คณะ (2568) ได้ทำการศึกษาเรื่อง การพัฒนา </w:t>
-      </w:r>
+        <w:t xml:space="preserve"> และ คณะ </w:t>
+      </w:r>
+      <w:bookmarkEnd w:id="19"/>
       <w:r>
         <w:rPr>
           <w:rFonts w:ascii="TH SarabunPSK" w:hAnsi="TH SarabunPSK" w:cs="TH SarabunPSK"/>
           <w:color w:val="000000" w:themeColor="text1"/>
           <w:sz w:val="32"/>
           <w:szCs w:val="32"/>
+          <w:cs/>
+        </w:rPr>
+        <w:t xml:space="preserve">(2568) ได้ทำการศึกษาเรื่อง การพัฒนา </w:t>
+      </w:r>
+      <w:r>
+        <w:rPr>
+          <w:rFonts w:ascii="TH SarabunPSK" w:hAnsi="TH SarabunPSK" w:cs="TH SarabunPSK"/>
+          <w:color w:val="000000" w:themeColor="text1"/>
+          <w:sz w:val="32"/>
+          <w:szCs w:val="32"/>
         </w:rPr>
         <w:t xml:space="preserve">AI Agent </w:t>
       </w:r>
@@ -37221,6 +37061,7 @@
         </w:rPr>
         <w:tab/>
       </w:r>
+      <w:bookmarkStart w:id="20" w:name="_Hlk228213087"/>
       <w:r>
         <w:rPr>
           <w:rFonts w:ascii="TH SarabunPSK" w:hAnsi="TH SarabunPSK" w:cs="TH SarabunPSK"/>
@@ -37229,14 +37070,25 @@
           <w:szCs w:val="32"/>
           <w:cs/>
         </w:rPr>
-        <w:t>สุมนา บุษบก และ คณะ (</w:t>
-      </w:r>
+        <w:t xml:space="preserve">สุมนา บุษบก และ คณะ </w:t>
+      </w:r>
+      <w:bookmarkEnd w:id="20"/>
       <w:r>
         <w:rPr>
           <w:rFonts w:ascii="TH SarabunPSK" w:hAnsi="TH SarabunPSK" w:cs="TH SarabunPSK"/>
           <w:color w:val="000000" w:themeColor="text1"/>
           <w:sz w:val="32"/>
           <w:szCs w:val="32"/>
+          <w:cs/>
+        </w:rPr>
+        <w:t>(</w:t>
+      </w:r>
+      <w:r>
+        <w:rPr>
+          <w:rFonts w:ascii="TH SarabunPSK" w:hAnsi="TH SarabunPSK" w:cs="TH SarabunPSK"/>
+          <w:color w:val="000000" w:themeColor="text1"/>
+          <w:sz w:val="32"/>
+          <w:szCs w:val="32"/>
         </w:rPr>
         <w:t xml:space="preserve">2568) </w:t>
       </w:r>
@@ -37377,6 +37229,7 @@
         </w:rPr>
         <w:tab/>
       </w:r>
+      <w:bookmarkStart w:id="21" w:name="_Hlk228213534"/>
       <w:proofErr w:type="spellStart"/>
       <w:r>
         <w:rPr>
@@ -37397,14 +37250,25 @@
           <w:szCs w:val="32"/>
           <w:cs/>
         </w:rPr>
-        <w:t xml:space="preserve"> สูงสว่าง และ คณะ (</w:t>
-      </w:r>
+        <w:t xml:space="preserve"> สูงสว่าง และ คณะ </w:t>
+      </w:r>
+      <w:bookmarkEnd w:id="21"/>
       <w:r>
         <w:rPr>
           <w:rFonts w:ascii="TH SarabunPSK" w:hAnsi="TH SarabunPSK" w:cs="TH SarabunPSK"/>
           <w:color w:val="000000" w:themeColor="text1"/>
           <w:sz w:val="32"/>
           <w:szCs w:val="32"/>
+          <w:cs/>
+        </w:rPr>
+        <w:t>(</w:t>
+      </w:r>
+      <w:r>
+        <w:rPr>
+          <w:rFonts w:ascii="TH SarabunPSK" w:hAnsi="TH SarabunPSK" w:cs="TH SarabunPSK"/>
+          <w:color w:val="000000" w:themeColor="text1"/>
+          <w:sz w:val="32"/>
+          <w:szCs w:val="32"/>
         </w:rPr>
         <w:t xml:space="preserve">2568) </w:t>
       </w:r>
@@ -37416,7 +37280,18 @@
           <w:szCs w:val="32"/>
           <w:cs/>
         </w:rPr>
-        <w:t xml:space="preserve">ได้ทำการศึกษาเรื่อง การพัฒนาระบบแชทบอทสำหรับเว็บไซต์มหาวิทยาลัยโดยใช้โมเดลภาษาขนาดใหญ่และการสร้างคำตอบด้วยการค้นคืนผ่านแพลตฟอร์ม </w:t>
+        <w:t xml:space="preserve">ได้ทำการศึกษาเรื่อง </w:t>
+      </w:r>
+      <w:bookmarkStart w:id="22" w:name="_Hlk228213552"/>
+      <w:r>
+        <w:rPr>
+          <w:rFonts w:ascii="TH SarabunPSK" w:hAnsi="TH SarabunPSK" w:cs="TH SarabunPSK"/>
+          <w:color w:val="000000" w:themeColor="text1"/>
+          <w:sz w:val="32"/>
+          <w:szCs w:val="32"/>
+          <w:cs/>
+        </w:rPr>
+        <w:t xml:space="preserve">การพัฒนาระบบแชทบอทสำหรับเว็บไซต์มหาวิทยาลัยโดยใช้โมเดลภาษาขนาดใหญ่และการสร้างคำตอบด้วยการค้นคืนผ่านแพลตฟอร์ม </w:t>
       </w:r>
       <w:proofErr w:type="spellStart"/>
       <w:r>
@@ -37428,6 +37303,7 @@
         </w:rPr>
         <w:t>Flowise</w:t>
       </w:r>
+      <w:bookmarkEnd w:id="22"/>
       <w:proofErr w:type="spellEnd"/>
       <w:r>
         <w:rPr>
@@ -37588,6 +37464,7 @@
           <w:szCs w:val="32"/>
         </w:rPr>
       </w:pPr>
+      <w:bookmarkStart w:id="23" w:name="_Hlk228213867"/>
       <w:r>
         <w:rPr>
           <w:rFonts w:ascii="TH SarabunPSK" w:hAnsi="TH SarabunPSK" w:cs="TH SarabunPSK"/>
@@ -37628,14 +37505,25 @@
           <w:szCs w:val="32"/>
           <w:cs/>
         </w:rPr>
-        <w:t xml:space="preserve"> ชื่นมนัส และ คณะ (2567) ได้ทำการศึกษาเรื่อง การวิจัยและพัฒนาระบบสนทนาอัตโนมัติในข้อมูลป้องกันประเทศ โดยมีวัตถุประสงค์เพื่อทดลองระบบจักรกลสนทนากับข้อมูลบทความในวารสารเทคโนโลยีป้องกันประเทศ ว่าสามารถให้ความรู้และตอบคำถามแก่บุคคลภายนอกเกี่ยวกับข้อมูลของเทคโนโลยีป้องกันประเทศได้แม่นยำเพียงใด โดยใช้เทคโนโลยีการดึงข้อมูลเชิงเพิ่มประสิทธิภาพ (</w:t>
-      </w:r>
+        <w:t xml:space="preserve"> ชื่นมนัส </w:t>
+      </w:r>
+      <w:bookmarkEnd w:id="23"/>
       <w:r>
         <w:rPr>
           <w:rFonts w:ascii="TH SarabunPSK" w:hAnsi="TH SarabunPSK" w:cs="TH SarabunPSK"/>
           <w:color w:val="000000" w:themeColor="text1"/>
           <w:sz w:val="32"/>
           <w:szCs w:val="32"/>
+          <w:cs/>
+        </w:rPr>
+        <w:t>และ คณะ (2567) ได้ทำการศึกษาเรื่อง การวิจัยและพัฒนาระบบสนทนาอัตโนมัติในข้อมูลป้องกันประเทศ โดยมีวัตถุประสงค์เพื่อทดลองระบบจักรกลสนทนากับข้อมูลบทความในวารสารเทคโนโลยีป้องกันประเทศ ว่าสามารถให้ความรู้และตอบคำถามแก่บุคคลภายนอกเกี่ยวกับข้อมูลของเทคโนโลยีป้องกันประเทศได้แม่นยำเพียงใด โดยใช้เทคโนโลยีการดึงข้อมูลเชิงเพิ่มประสิทธิภาพ (</w:t>
+      </w:r>
+      <w:r>
+        <w:rPr>
+          <w:rFonts w:ascii="TH SarabunPSK" w:hAnsi="TH SarabunPSK" w:cs="TH SarabunPSK"/>
+          <w:color w:val="000000" w:themeColor="text1"/>
+          <w:sz w:val="32"/>
+          <w:szCs w:val="32"/>
         </w:rPr>
         <w:t xml:space="preserve">Retrieval-Augmented Generation: RAG) </w:t>
       </w:r>
@@ -37729,6 +37617,7 @@
         </w:rPr>
         <w:tab/>
       </w:r>
+      <w:bookmarkStart w:id="24" w:name="_Hlk228214163"/>
       <w:r>
         <w:rPr>
           <w:rFonts w:ascii="TH SarabunPSK" w:hAnsi="TH SarabunPSK" w:cs="TH SarabunPSK"/>
@@ -37759,14 +37648,25 @@
           <w:szCs w:val="32"/>
           <w:cs/>
         </w:rPr>
-        <w:t xml:space="preserve"> และ เจษฎา ชาตรี (</w:t>
-      </w:r>
+        <w:t xml:space="preserve"> และ เจษฎา ชาตรี </w:t>
+      </w:r>
+      <w:bookmarkEnd w:id="24"/>
       <w:r>
         <w:rPr>
           <w:rFonts w:ascii="TH SarabunPSK" w:hAnsi="TH SarabunPSK" w:cs="TH SarabunPSK"/>
           <w:color w:val="000000" w:themeColor="text1"/>
           <w:sz w:val="32"/>
           <w:szCs w:val="32"/>
+          <w:cs/>
+        </w:rPr>
+        <w:t>(</w:t>
+      </w:r>
+      <w:r>
+        <w:rPr>
+          <w:rFonts w:ascii="TH SarabunPSK" w:hAnsi="TH SarabunPSK" w:cs="TH SarabunPSK"/>
+          <w:color w:val="000000" w:themeColor="text1"/>
+          <w:sz w:val="32"/>
+          <w:szCs w:val="32"/>
         </w:rPr>
         <w:t xml:space="preserve">2567) </w:t>
       </w:r>
@@ -37869,6 +37769,7 @@
         </w:rPr>
         <w:tab/>
       </w:r>
+      <w:bookmarkStart w:id="25" w:name="_Hlk228214369"/>
       <w:r>
         <w:rPr>
           <w:rFonts w:ascii="TH SarabunPSK" w:hAnsi="TH SarabunPSK" w:cs="TH SarabunPSK"/>
@@ -37932,6 +37833,7 @@
         </w:rPr>
         <w:t xml:space="preserve">2568) </w:t>
       </w:r>
+      <w:bookmarkEnd w:id="25"/>
       <w:r>
         <w:rPr>
           <w:rFonts w:ascii="TH SarabunPSK" w:hAnsi="TH SarabunPSK" w:cs="TH SarabunPSK"/>
@@ -37940,7 +37842,29 @@
           <w:szCs w:val="32"/>
           <w:cs/>
         </w:rPr>
-        <w:t xml:space="preserve">ได้ทำการศึกษาเรื่อง ระบบการเรียนรู้ความต้องการเพื่อสั่งซื้อสินค้าที่มีความเกี่ยวข้องกัน เพื่อรองรับระบบลูกค้าสัมพันธ์ โดยมีวัตถุประสงค์เพื่อพัฒนาระบบแชทบอทอัจฉริยะผ่านเว็บแอปพลิเคชันที่เชื่อมต่อกับแพลตฟอร์มไลน์ เพื่อเป็นสื่อกลางในการสื่อสาร บันทึกข้อมูลความต้องการ และแนะนำสินค้าให้ตรงกับความต้องการของลูกค้า โดยเฉพาะในกลุ่มธุรกิจกระจกและวัสดุก่อสร้าง ผลการศึกษาพบว่าโมเดลการคัดกรองความต้องการลูกค้ามีความถูกต้องแม่นยำอยู่ที่ร้อยละ </w:t>
+        <w:t xml:space="preserve">ได้ทำการศึกษาเรื่อง </w:t>
+      </w:r>
+      <w:bookmarkStart w:id="26" w:name="_Hlk228214388"/>
+      <w:r>
+        <w:rPr>
+          <w:rFonts w:ascii="TH SarabunPSK" w:hAnsi="TH SarabunPSK" w:cs="TH SarabunPSK"/>
+          <w:color w:val="000000" w:themeColor="text1"/>
+          <w:sz w:val="32"/>
+          <w:szCs w:val="32"/>
+          <w:cs/>
+        </w:rPr>
+        <w:t>ระบบการเรียนรู้ความต้องการเพื่อสั่งซื้อสินค้าที่มีความเกี่ยวข้องกัน เพื่อรองรับระบบลูกค้าสัมพันธ์</w:t>
+      </w:r>
+      <w:bookmarkEnd w:id="26"/>
+      <w:r>
+        <w:rPr>
+          <w:rFonts w:ascii="TH SarabunPSK" w:hAnsi="TH SarabunPSK" w:cs="TH SarabunPSK"/>
+          <w:color w:val="000000" w:themeColor="text1"/>
+          <w:sz w:val="32"/>
+          <w:szCs w:val="32"/>
+          <w:cs/>
+        </w:rPr>
+        <w:t xml:space="preserve"> โดยมีวัตถุประสงค์เพื่อพัฒนาระบบแชทบอทอัจฉริยะผ่านเว็บแอปพลิเคชันที่เชื่อมต่อกับแพลตฟอร์มไลน์ เพื่อเป็นสื่อกลางในการสื่อสาร บันทึกข้อมูลความต้องการ และแนะนำสินค้าให้ตรงกับความต้องการของลูกค้า โดยเฉพาะในกลุ่มธุรกิจกระจกและวัสดุก่อสร้าง ผลการศึกษาพบว่าโมเดลการคัดกรองความต้องการลูกค้ามีความถูกต้องแม่นยำอยู่ที่ร้อยละ </w:t>
       </w:r>
       <w:r>
         <w:rPr>
@@ -38222,9 +38146,10 @@
       </w:pPr>
     </w:p>
     <w:sectPr>
+      <w:headerReference w:type="default" r:id="rId28"/>
       <w:pgSz w:w="11906" w:h="16838" w:code="9"/>
       <w:pgMar w:top="2160" w:right="1440" w:bottom="1440" w:left="2160" w:header="1440" w:footer="720" w:gutter="0"/>
-      <w:pgNumType w:start="5"/>
+      <w:pgNumType w:start="8"/>
       <w:cols w:space="708"/>
       <w:docGrid w:linePitch="360"/>
     </w:sectPr>
@@ -38276,6 +38201,96 @@
     <w:pPr>
       <w:pStyle w:val="Header"/>
       <w:jc w:val="right"/>
+    </w:pPr>
+  </w:p>
+</w:hdr>
+</file>
+
+<file path=word/header2.xml><?xml version="1.0" encoding="utf-8"?>
+<w:hdr xmlns:wpc="http://schemas.microsoft.com/office/word/2010/wordprocessingCanvas" xmlns:cx="http://schemas.microsoft.com/office/drawing/2014/chartex" xmlns:cx1="http://schemas.microsoft.com/office/drawing/2015/9/8/chartex" xmlns:cx2="http://schemas.microsoft.com/office/drawing/2015/10/21/chartex" xmlns:cx3="http://schemas.microsoft.com/office/drawing/2016/5/9/chartex" xmlns:cx4="http://schemas.microsoft.com/office/drawing/2016/5/10/chartex" xmlns:cx5="http://schemas.microsoft.com/office/drawing/2016/5/11/chartex" xmlns:cx6="http://schemas.microsoft.com/office/drawing/2016/5/12/chartex" xmlns:cx7="http://schemas.microsoft.com/office/drawing/2016/5/13/chartex" xmlns:cx8="http://schemas.microsoft.com/office/drawing/2016/5/14/chartex" xmlns:mc="http://schemas.openxmlformats.org/markup-compatibility/2006" xmlns:aink="http://schemas.microsoft.com/office/drawing/2016/ink" xmlns:am3d="http://schemas.microsoft.com/office/drawing/2017/model3d" xmlns:o="urn:schemas-microsoft-com:office:office" xmlns:r="http://schemas.openxmlformats.org/officeDocument/2006/relationships" xmlns:m="http://schemas.openxmlformats.org/officeDocument/2006/math" xmlns:v="urn:schemas-microsoft-com:vml" xmlns:wp14="http://schemas.microsoft.com/office/word/2010/wordprocessingDrawing" xmlns:wp="http://schemas.openxmlformats.org/drawingml/2006/wordprocessingDrawing" xmlns:w10="urn:schemas-microsoft-com:office:word" xmlns:w="http://schemas.openxmlformats.org/wordprocessingml/2006/main" xmlns:w14="http://schemas.microsoft.com/office/word/2010/wordml" xmlns:w15="http://schemas.microsoft.com/office/word/2012/wordml" xmlns:w16cex="http://schemas.microsoft.com/office/word/2018/wordml/cex" xmlns:w16cid="http://schemas.microsoft.com/office/word/2016/wordml/cid" xmlns:w16="http://schemas.microsoft.com/office/word/2018/wordml" xmlns:w16sdtdh="http://schemas.microsoft.com/office/word/2020/wordml/sdtdatahash" xmlns:w16se="http://schemas.microsoft.com/office/word/2015/wordml/symex" xmlns:wpg="http://schemas.microsoft.com/office/word/2010/wordprocessingGroup" xmlns:wpi="http://schemas.microsoft.com/office/word/2010/wordprocessingInk" xmlns:wne="http://schemas.microsoft.com/office/word/2006/wordml" xmlns:wps="http://schemas.microsoft.com/office/word/2010/wordprocessingShape" mc:Ignorable="w14 w15 w16se w16cid w16 w16cex w16sdtdh wp14">
+  <w:sdt>
+    <w:sdtPr>
+      <w:rPr>
+        <w:rFonts w:ascii="TH SarabunPSK" w:hAnsi="TH SarabunPSK" w:cs="TH SarabunPSK" w:hint="cs"/>
+        <w:sz w:val="32"/>
+        <w:szCs w:val="32"/>
+      </w:rPr>
+      <w:id w:val="1643692269"/>
+      <w:docPartObj>
+        <w:docPartGallery w:val="Page Numbers (Top of Page)"/>
+        <w:docPartUnique/>
+      </w:docPartObj>
+    </w:sdtPr>
+    <w:sdtEndPr>
+      <w:rPr>
+        <w:noProof/>
+      </w:rPr>
+    </w:sdtEndPr>
+    <w:sdtContent>
+      <w:p>
+        <w:pPr>
+          <w:pStyle w:val="Header"/>
+          <w:jc w:val="right"/>
+          <w:rPr>
+            <w:rFonts w:ascii="TH SarabunPSK" w:hAnsi="TH SarabunPSK" w:cs="TH SarabunPSK"/>
+            <w:sz w:val="32"/>
+            <w:szCs w:val="32"/>
+          </w:rPr>
+        </w:pPr>
+        <w:r>
+          <w:rPr>
+            <w:rFonts w:ascii="TH SarabunPSK" w:hAnsi="TH SarabunPSK" w:cs="TH SarabunPSK" w:hint="cs"/>
+            <w:sz w:val="32"/>
+            <w:szCs w:val="32"/>
+          </w:rPr>
+          <w:fldChar w:fldCharType="begin"/>
+        </w:r>
+        <w:r>
+          <w:rPr>
+            <w:rFonts w:ascii="TH SarabunPSK" w:hAnsi="TH SarabunPSK" w:cs="TH SarabunPSK" w:hint="cs"/>
+            <w:sz w:val="32"/>
+            <w:szCs w:val="32"/>
+          </w:rPr>
+          <w:instrText xml:space="preserve"> PAGE   \* MERGEFORMAT </w:instrText>
+        </w:r>
+        <w:r>
+          <w:rPr>
+            <w:rFonts w:ascii="TH SarabunPSK" w:hAnsi="TH SarabunPSK" w:cs="TH SarabunPSK" w:hint="cs"/>
+            <w:sz w:val="32"/>
+            <w:szCs w:val="32"/>
+          </w:rPr>
+          <w:fldChar w:fldCharType="separate"/>
+        </w:r>
+        <w:r>
+          <w:rPr>
+            <w:rFonts w:ascii="TH SarabunPSK" w:hAnsi="TH SarabunPSK" w:cs="TH SarabunPSK" w:hint="cs"/>
+            <w:noProof/>
+            <w:sz w:val="32"/>
+            <w:szCs w:val="32"/>
+          </w:rPr>
+          <w:t>2</w:t>
+        </w:r>
+        <w:r>
+          <w:rPr>
+            <w:rFonts w:ascii="TH SarabunPSK" w:hAnsi="TH SarabunPSK" w:cs="TH SarabunPSK" w:hint="cs"/>
+            <w:noProof/>
+            <w:sz w:val="32"/>
+            <w:szCs w:val="32"/>
+          </w:rPr>
+          <w:fldChar w:fldCharType="end"/>
+        </w:r>
+      </w:p>
+    </w:sdtContent>
+  </w:sdt>
+  <w:p>
+    <w:pPr>
+      <w:pStyle w:val="Header"/>
+      <w:jc w:val="right"/>
+      <w:rPr>
+        <w:rFonts w:ascii="TH SarabunPSK" w:hAnsi="TH SarabunPSK" w:cs="TH SarabunPSK"/>
+        <w:sz w:val="32"/>
+        <w:szCs w:val="32"/>
+      </w:rPr>
     </w:pPr>
   </w:p>
 </w:hdr>

</xml_diff>